<commit_message>
docs: finalize topic as Footprint, trim spec to v2.0
- Confirm Footprint (group project process record & peer review
  support) as the capstone topic; drop Itsum and Chaekbakwi
- Spec v2.0: remove chapters 2-3 and appendix, renumber tools &
  schedule chapter to 2 (12 pages)
- Add in-depth walkthrough script for spec pages 3-12
- Update summary to v5 with confirmed topic and new file layout
- Keep spec v1.2 (3 topics, 29 pages) as review submission record
</commit_message>
<xml_diff>
--- a/9월_3주/발자국_명세해설_발표대본.docx
+++ b/9월_3주/발자국_명세해설_발표대본.docx
@@ -29,7 +29,7 @@
           <w:sz w:val="30"/>
           <w:szCs w:val="30"/>
         </w:rPr>
-        <w:t xml:space="preserve">조별과제 과정기록 &amp; 평가지원 서비스 — 명세서 3~11쪽 · 29쪽 해설</w:t>
+        <w:t xml:space="preserve">조별과제 과정기록 &amp; 평가지원 서비스 — 명세서 v2.0 전체(12쪽) 해설</w:t>
       </w:r>
     </w:p>
     <w:p>
@@ -129,7 +129,7 @@
           <w:sz w:val="22"/>
           <w:szCs w:val="22"/>
         </w:rPr>
-        <w:t xml:space="preserve">프로젝트 주제 아이디어 명세 v1.2 — 1장 발자국(3~11쪽), 5장 일정(29쪽)</w:t>
+        <w:t xml:space="preserve">프로젝트 주제 명세 v2.0 (12쪽) — 1장 발자국(3~11쪽), 2장 일정(12쪽)</w:t>
       </w:r>
     </w:p>
     <w:p>
@@ -236,7 +236,7 @@
           <w:sz w:val="22"/>
           <w:szCs w:val="22"/>
         </w:rPr>
-        <w:t xml:space="preserve">까지를 순서대로 설명드리고, 마지막에 29쪽 일정을 발자국 기준으로 말씀드리겠습니다.</w:t>
+        <w:t xml:space="preserve">까지를 순서대로 설명드리고, 마지막에 12쪽 일정을 발자국 기준으로 말씀드리겠습니다.</w:t>
       </w:r>
     </w:p>
     <w:p>
@@ -2150,7 +2150,7 @@
           <w:sz w:val="18"/>
           <w:szCs w:val="18"/>
         </w:rPr>
-        <w:t xml:space="preserve">11쪽 1.9 리스크표 · 1.10 예상 질문 → 29쪽</w:t>
+        <w:t xml:space="preserve">11쪽 1.9 리스크표 · 1.10 예상 질문 → 12쪽</w:t>
       </w:r>
     </w:p>
     <w:p>
@@ -2167,34 +2167,34 @@
           <w:sz w:val="30"/>
           <w:szCs w:val="30"/>
         </w:rPr>
-        <w:t xml:space="preserve">9. 일정 — 29쪽 (약 1분)</w:t>
-      </w:r>
-    </w:p>
-    <w:p>
-      <w:pPr>
-        <w:spacing w:after="160" w:line="340"/>
-      </w:pPr>
-      <w:r>
-        <w:rPr>
-          <w:rFonts w:ascii="Malgun Gothic" w:cs="Malgun Gothic" w:eastAsia="Malgun Gothic" w:hAnsi="Malgun Gothic"/>
-          <w:b/>
-          <w:bCs/>
-          <w:color w:val="211D2B"/>
-          <w:sz w:val="22"/>
-          <w:szCs w:val="22"/>
-        </w:rPr>
-        <w:t xml:space="preserve">자료 마지막 29쪽</w:t>
-      </w:r>
-      <w:r>
-        <w:rPr>
-          <w:rFonts w:ascii="Malgun Gothic" w:cs="Malgun Gothic" w:eastAsia="Malgun Gothic" w:hAnsi="Malgun Gothic"/>
-          <w:b w:val="false"/>
-          <w:bCs w:val="false"/>
-          <w:color w:val="211D2B"/>
-          <w:sz w:val="22"/>
-          <w:szCs w:val="22"/>
-        </w:rPr>
-        <w:t xml:space="preserve">을 봐주십시오. 도구는 리액트, 스프링 부트 3, JPA, 스프링 시큐리티, 포스트그레스큐엘, 도커이고, 백엔드 골격과 DB, 실행 환경은 조장이 맡습니다. 나머지 담당은 주제가 확정되었으니 첫 회의에서 정합니다. 전원이 이 도구를 처음 씁니다.</w:t>
+        <w:t xml:space="preserve">9. 일정 — 12쪽 (약 1분)</w:t>
+      </w:r>
+    </w:p>
+    <w:p>
+      <w:pPr>
+        <w:spacing w:after="160" w:line="340"/>
+      </w:pPr>
+      <w:r>
+        <w:rPr>
+          <w:rFonts w:ascii="Malgun Gothic" w:cs="Malgun Gothic" w:eastAsia="Malgun Gothic" w:hAnsi="Malgun Gothic"/>
+          <w:b/>
+          <w:bCs/>
+          <w:color w:val="211D2B"/>
+          <w:sz w:val="22"/>
+          <w:szCs w:val="22"/>
+        </w:rPr>
+        <w:t xml:space="preserve">자료 마지막 12쪽</w:t>
+      </w:r>
+      <w:r>
+        <w:rPr>
+          <w:rFonts w:ascii="Malgun Gothic" w:cs="Malgun Gothic" w:eastAsia="Malgun Gothic" w:hAnsi="Malgun Gothic"/>
+          <w:b w:val="false"/>
+          <w:bCs w:val="false"/>
+          <w:color w:val="211D2B"/>
+          <w:sz w:val="22"/>
+          <w:szCs w:val="22"/>
+        </w:rPr>
+        <w:t xml:space="preserve">을 봐주십시오. 도구는 리액트, 스프링 부트 3, JPA, 스프링 시큐리티, 포스트그레스큐엘, 도커이고, 백엔드 골격과 DB, 실행 환경은 조장이 맡습니다. 나머지 담당은 첫 회의에서 정합니다. 전원이 이 도구를 처음 씁니다.</w:t>
       </w:r>
     </w:p>
     <w:p>
@@ -2232,7 +2232,7 @@
           <w:sz w:val="22"/>
           <w:szCs w:val="22"/>
         </w:rPr>
-        <w:t xml:space="preserve"> 기준입니다. 9월 말까지 요구사항 분석과 학습, 10월 중순까지 ERD와 API 명세, 화면 설계와 함께 골격을 세우고, 중간고사를 빼고 11월에 핵심 흐름을 구현합니다. 12월 11일까지의 목표는 5.3 표의 발자국 줄, </w:t>
+        <w:t xml:space="preserve"> 기준입니다. 9월 말까지 요구사항 분석과 학습, 10월 중순까지 ERD와 API 명세, 화면 설계와 함께 골격을 세우고, 중간고사를 빼고 11월에 핵심 흐름을 구현합니다. 12월 11일까지의 목표는 2.3 표의, </w:t>
       </w:r>
       <w:r>
         <w:rPr>
@@ -2287,7 +2287,7 @@
           <w:sz w:val="18"/>
           <w:szCs w:val="18"/>
         </w:rPr>
-        <w:t xml:space="preserve">29쪽 5.1 도구·담당 · 5.2 일정 · 5.3 12.11까지 목표</w:t>
+        <w:t xml:space="preserve">12쪽 2.1 도구·담당 · 2.2 일정 · 2.3 12.11까지 목표</w:t>
       </w:r>
     </w:p>
     <w:p>

</xml_diff>